<commit_message>
test(reports): refresh generated artifact evidence
</commit_message>
<xml_diff>
--- a/evals/results/003-reports-artifacts/comparison-report-en-US.docx
+++ b/evals/results/003-reports-artifacts/comparison-report-en-US.docx
@@ -12,7 +12,7 @@
     </w:p>
     <w:p>
       <w:r>
-        <w:t>Source run: 9ece3d19-d464-4f53-b214-bfee1ca66f20</w:t>
+        <w:t>Source run: 4d18c4cb-758c-4e3a-92b1-e021fe834a86</w:t>
       </w:r>
     </w:p>
     <w:p>
@@ -69,7 +69,7 @@
     </w:p>
     <w:p>
       <w:r>
-        <w:t>[E1] atlas://comparison/9ece3d19-d464-4f53-b214-bfee1ca66f20/evidence/e9b6bb46-b399-48a2-ba12-ab91eaa2a8e3</w:t>
+        <w:t>[E1] atlas://comparison/4d18c4cb-758c-4e3a-92b1-e021fe834a86/evidence/7c6dd4ec-ab66-4c41-850e-85b18e5e3bd6</w:t>
       </w:r>
     </w:p>
     <w:p>
@@ -82,7 +82,7 @@
     </w:p>
     <w:p>
       <w:r>
-        <w:t>[E1] atlas://comparison/9ece3d19-d464-4f53-b214-bfee1ca66f20/evidence/e9b6bb46-b399-48a2-ba12-ab91eaa2a8e3 — Original evidence: Original evidence is available in the source run evidence panel; citation identity e9b6bb46-b399-48a2-ba12-ab91eaa2a8e3 is preserved.</w:t>
+        <w:t>[E1] atlas://comparison/4d18c4cb-758c-4e3a-92b1-e021fe834a86/evidence/7c6dd4ec-ab66-4c41-850e-85b18e5e3bd6 — Original evidence: Original evidence is available in the source run evidence panel; citation identity 7c6dd4ec-ab66-4c41-850e-85b18e5e3bd6 is preserved.</w:t>
       </w:r>
     </w:p>
     <w:sectPr>

</xml_diff>